<commit_message>
feat: add field filter search MVP
</commit_message>
<xml_diff>
--- a/tests/fixtures/resumes/synthetic-java-engineer.docx
+++ b/tests/fixtures/resumes/synthetic-java-engineer.docx
@@ -5,6 +5,21 @@
     <w:p>
       <w:r>
         <w:t>Synthetic Java Engineer</w:t>
+      </w:r>
+    </w:p>
+    <w:p>
+      <w:r>
+        <w:t>Education</w:t>
+      </w:r>
+    </w:p>
+    <w:p>
+      <w:r>
+        <w:t>Synthetic University</w:t>
+      </w:r>
+    </w:p>
+    <w:p>
+      <w:r>
+        <w:t>Bachelor of Science in Computer Science</w:t>
       </w:r>
     </w:p>
     <w:p>
@@ -19,12 +34,12 @@
     </w:p>
     <w:p>
       <w:r>
-        <w:t>Skills</w:t>
+        <w:t>2020.01 - 2024.03</w:t>
       </w:r>
     </w:p>
     <w:p>
       <w:r>
-        <w:t>Java Rust SQLite Tantivy</w:t>
+        <w:t>Skills: Java, Rust, SQLite, Tantivy</w:t>
       </w:r>
     </w:p>
   </w:body>

</xml_diff>

<commit_message>
test(import): prepare classifier admission fixtures
</commit_message>
<xml_diff>
--- a/tests/fixtures/resumes/synthetic-java-engineer.docx
+++ b/tests/fixtures/resumes/synthetic-java-engineer.docx
@@ -29,6 +29,11 @@
     </w:p>
     <w:p>
       <w:r>
+        <w:t>Developed local search tooling.</w:t>
+      </w:r>
+    </w:p>
+    <w:p>
+      <w:r>
         <w:t>Maintained Java search services and local indexing pipelines.</w:t>
       </w:r>
     </w:p>

</xml_diff>

<commit_message>
test(import): prepare classifier-admission fixtures (#160)
Part of #159. Synthetic fixture preparation only; production classifier admission remains open.
</commit_message>
<xml_diff>
--- a/tests/fixtures/resumes/synthetic-java-engineer.docx
+++ b/tests/fixtures/resumes/synthetic-java-engineer.docx
@@ -29,6 +29,11 @@
     </w:p>
     <w:p>
       <w:r>
+        <w:t>Developed local search tooling.</w:t>
+      </w:r>
+    </w:p>
+    <w:p>
+      <w:r>
         <w:t>Maintained Java search services and local indexing pipelines.</w:t>
       </w:r>
     </w:p>

</xml_diff>